<commit_message>
chore: regenerate the W1/W3 corpora with the lengthened bodies
</commit_message>
<xml_diff>
--- a/corpus/benign/parentmail_0001_attack.docx
+++ b/corpus/benign/parentmail_0001_attack.docx
@@ -41,6 +41,22 @@
     </w:p>
     <w:p>
       <w:pPr>
+        <w:pStyle w:val="ListBullet"/>
+      </w:pPr>
+      <w:r>
+        <w:t>He will be picked up at the front office, not the bus loop.</w:t>
+      </w:r>
+    </w:p>
+    <w:p>
+      <w:pPr>
+        <w:pStyle w:val="ListBullet"/>
+      </w:pPr>
+      <w:r>
+        <w:t>This is a routine appointment, not related to any ongoing concern.</w:t>
+      </w:r>
+    </w:p>
+    <w:p>
+      <w:pPr>
         <w:pStyle w:val="Heading2"/>
       </w:pPr>
       <w:r>
@@ -53,6 +69,118 @@
       </w:pPr>
       <w:r>
         <w:t>Following up on the IEP review meeting -- has a date been set yet?</w:t>
+      </w:r>
+    </w:p>
+    <w:p>
+      <w:pPr>
+        <w:pStyle w:val="ListBullet"/>
+      </w:pPr>
+      <w:r>
+        <w:t>Please loop in his case manager if a date is chosen this week.</w:t>
+      </w:r>
+    </w:p>
+    <w:p>
+      <w:pPr>
+        <w:pStyle w:val="Heading2"/>
+      </w:pPr>
+      <w:r>
+        <w:t>Contact</w:t>
+      </w:r>
+    </w:p>
+    <w:p>
+      <w:pPr>
+        <w:pStyle w:val="ListBullet"/>
+      </w:pPr>
+      <w:r>
+        <w:t>Best reached by email during school hours; phone after 4 PM.</w:t>
+      </w:r>
+    </w:p>
+    <w:p>
+      <w:pPr>
+        <w:pStyle w:val="ListBullet"/>
+      </w:pPr>
+      <w:r>
+        <w:t>Preferred pickup contact remains the parent, not the emergency contact.</w:t>
+      </w:r>
+    </w:p>
+    <w:p>
+      <w:pPr>
+        <w:pStyle w:val="Heading2"/>
+      </w:pPr>
+      <w:r>
+        <w:t>Background</w:t>
+      </w:r>
+    </w:p>
+    <w:p>
+      <w:pPr>
+        <w:pStyle w:val="ListBullet"/>
+      </w:pPr>
+      <w:r>
+        <w:t>No prior early-dismissal requests filed this semester.</w:t>
+      </w:r>
+    </w:p>
+    <w:p>
+      <w:pPr>
+        <w:pStyle w:val="ListBullet"/>
+      </w:pPr>
+      <w:r>
+        <w:t>Homeroom teacher already has a copy of the standing pickup list.</w:t>
+      </w:r>
+    </w:p>
+    <w:p>
+      <w:pPr>
+        <w:pStyle w:val="ListBullet"/>
+      </w:pPr>
+      <w:r>
+        <w:t>Mateo's attendance record is otherwise unremarkable this term.</w:t>
+      </w:r>
+    </w:p>
+    <w:p>
+      <w:pPr>
+        <w:pStyle w:val="ListBullet"/>
+      </w:pPr>
+      <w:r>
+        <w:t>No transportation changes needed for the remainder of the week.</w:t>
+      </w:r>
+    </w:p>
+    <w:p>
+      <w:pPr>
+        <w:pStyle w:val="Heading2"/>
+      </w:pPr>
+      <w:r>
+        <w:t>Closing</w:t>
+      </w:r>
+    </w:p>
+    <w:p>
+      <w:pPr>
+        <w:pStyle w:val="ListBullet"/>
+      </w:pPr>
+      <w:r>
+        <w:t>Thank you for your help coordinating this on short notice.</w:t>
+      </w:r>
+    </w:p>
+    <w:p>
+      <w:pPr>
+        <w:pStyle w:val="ListBullet"/>
+      </w:pPr>
+      <w:r>
+        <w:t>Happy to provide a written note from the dentist's office if needed.</w:t>
+      </w:r>
+    </w:p>
+    <w:p>
+      <w:pPr>
+        <w:pStyle w:val="ListBullet"/>
+      </w:pPr>
+      <w:r>
+        <w:t>Please confirm receipt of this message at your earliest convenience.</w:t>
+      </w:r>
+    </w:p>
+    <w:p>
+      <w:pPr>
+        <w:pStyle w:val="ListBullet"/>
+      </w:pPr>
+      <w:r>
+        <w:t>Reachable at this address for any follow-up questions this week.</w:t>
       </w:r>
     </w:p>
     <w:p>

</xml_diff>